<commit_message>
Reframe the FlexTrade CV around problems solved with AI
Co-Authored-By: Claude Opus 5.5 <noreply@anthropic.com>
Claude-Session: https://claude.ai/code/session_01Qg3JRGKeFtCXXeV9rGpzwA
</commit_message>
<xml_diff>
--- a/dist/Jessie-Chan-CV-flextrade-marketing.docx
+++ b/dist/Jessie-Chan-CV-flextrade-marketing.docx
@@ -52,7 +52,7 @@
           <w:sz w:val="20"/>
           <w:szCs w:val="20"/>
         </w:rPr>
-        <w:t xml:space="preserve">Fintech/crypto marketer working across demand generation and product marketing for retail, wealth and institutional products in 26 markets. I plan and run campaigns myself, from paid media and email to content and landing pages, and work closely with Sales, Product and Compliance. I use AI and automation to ship faster, and bring a data-science research background.</w:t>
+        <w:t xml:space="preserve">Fintech/crypto marketer who finds the problem first, then solves it with AI. Working across demand generation and product marketing for retail, wealth and institutional products in 26 markets, I have used AI to replace manual creative production, reporting and localisation, and to open new client channels. I work closely with Sales, Product and Compliance, and bring a data-science research background.</w:t>
       </w:r>
     </w:p>
     <w:p>
@@ -155,7 +155,7 @@
           <w:sz w:val="20"/>
           <w:szCs w:val="20"/>
         </w:rPr>
-        <w:t xml:space="preserve">Generated 20+ active leads for Institutional business development by building a 100-operator prospect database, working with B2B Product Marketing on Institutional and Wealth projects</w:t>
+        <w:t xml:space="preserve">Identified that reliance on real creators was exhausting ad creative and built an AI-powered UGC production workflow, delivering 100+ video assets across TikTok and Google Ads, increasing CTR from 0.4% to 1.15% (+188%), reducing CPI from $25 to $6 (−76%), and cutting production time by 75%</w:t>
       </w:r>
     </w:p>
     <w:p>
@@ -177,7 +177,7 @@
           <w:sz w:val="20"/>
           <w:szCs w:val="20"/>
         </w:rPr>
-        <w:t xml:space="preserve">Built an outreach channel of 80 crypto publishers for high net worth client acquisition that sourced 3 major clients</w:t>
+        <w:t xml:space="preserve">Solved outdated creator assets after the Earn rebrand by recreating them with AI UGC, driving 600+ installs in the first week after relaunch</w:t>
       </w:r>
     </w:p>
     <w:p>
@@ -199,7 +199,7 @@
           <w:sz w:val="20"/>
           <w:szCs w:val="20"/>
         </w:rPr>
-        <w:t xml:space="preserve">Converted 4 high net worth clients onto the loans product in Malaysia within 1 month of launch, running go-to-market across paid media, affiliate and referral channels, and establishing a compliance review process for the new market</w:t>
+        <w:t xml:space="preserve">Spotted a high net worth acquisition opportunity during the MiCAR transition and built an 80-publisher contact list with AI, sourcing 3 major clients</w:t>
       </w:r>
     </w:p>
     <w:p>
@@ -221,7 +221,7 @@
           <w:sz w:val="20"/>
           <w:szCs w:val="20"/>
         </w:rPr>
-        <w:t xml:space="preserve">Grew cumulative perps trading volume from $100m to $500m in two months, and increased user retention by 12% through voice-of-customer research with active, inactive and churned users</w:t>
+        <w:t xml:space="preserve">Replaced 30 min/day of manual paid media reporting with automation built in Claude Code, Cursor and MCP connectors, and partnered with Data Engineering and Security to publish it as an internal dashboard</w:t>
       </w:r>
     </w:p>
     <w:p>
@@ -243,7 +243,7 @@
           <w:sz w:val="20"/>
           <w:szCs w:val="20"/>
         </w:rPr>
-        <w:t xml:space="preserve">Developed an AI-powered UGC production workflow, delivering 100+ video assets across TikTok and Google Ads, increasing CTR from 0.4% to 1.15% (+188%), reducing CPI from $25 to $6 (−76%), and cutting production time by 75%</w:t>
+        <w:t xml:space="preserve">Automated localisation of CRM communications into 24 languages with built-in CRM APIs, increasing email open rate by 10%</w:t>
       </w:r>
     </w:p>
     <w:p>
@@ -265,7 +265,7 @@
           <w:sz w:val="20"/>
           <w:szCs w:val="20"/>
         </w:rPr>
-        <w:t xml:space="preserve">Led international expansion of paid search, increasing markets from 2 to 26 (13x), live campaigns from 9 to 121 (13x) and keywords from 47 to 2,597 (55x) with country-level bid and creative strategy</w:t>
+        <w:t xml:space="preserve">Found through voice-of-customer research that users churned because they did not understand perps, and introduced an explainer that increased user retention by 12% as cumulative trading volume grew from $100m to $500m (5x) in two months</w:t>
       </w:r>
     </w:p>
     <w:p>
@@ -287,7 +287,7 @@
           <w:sz w:val="20"/>
           <w:szCs w:val="20"/>
         </w:rPr>
-        <w:t xml:space="preserve">Implemented built-in API in CRM tools to localise communications into 24 languages, increasing email open rate by 10%</w:t>
+        <w:t xml:space="preserve">Generated 20+ active leads for Institutional business development by building a 100-operator prospect database, working with B2B Product Marketing on Institutional and Wealth projects</w:t>
       </w:r>
     </w:p>
     <w:p>
@@ -309,68 +309,7 @@
           <w:sz w:val="20"/>
           <w:szCs w:val="20"/>
         </w:rPr>
-        <w:t xml:space="preserve">Automated daily paid media channels reporting with Claude Code, Cursor and MCP connectors, cutting 30 min/day of manual work, and partnered with Data Engineering and Security to publish it as an internal dashboard</w:t>
-      </w:r>
-    </w:p>
-    <w:p>
-      <w:pPr>
-        <w:tabs>
-          <w:tab w:val="right" w:pos="10466"/>
-        </w:tabs>
-        <w:spacing w:after="10" w:before="100"/>
-      </w:pPr>
-      <w:r>
-        <w:rPr>
-          <w:rFonts w:ascii="Calibri" w:cs="Calibri" w:eastAsia="Calibri" w:hAnsi="Calibri"/>
-          <w:b/>
-          <w:bCs/>
-          <w:i w:val="false"/>
-          <w:iCs w:val="false"/>
-          <w:sz w:val="20"/>
-          <w:szCs w:val="20"/>
-        </w:rPr>
-        <w:t xml:space="preserve">Performance Marketer</w:t>
-      </w:r>
-      <w:r>
-        <w:rPr>
-          <w:rFonts w:ascii="Calibri" w:cs="Calibri" w:eastAsia="Calibri" w:hAnsi="Calibri"/>
-          <w:b w:val="false"/>
-          <w:bCs w:val="false"/>
-          <w:i w:val="false"/>
-          <w:iCs w:val="false"/>
-          <w:sz w:val="20"/>
-          <w:szCs w:val="20"/>
-        </w:rPr>
-        <w:t xml:space="preserve">	</w:t>
-      </w:r>
-      <w:r>
-        <w:rPr>
-          <w:rFonts w:ascii="Calibri" w:cs="Calibri" w:eastAsia="Calibri" w:hAnsi="Calibri"/>
-          <w:b/>
-          <w:bCs/>
-          <w:i w:val="false"/>
-          <w:iCs w:val="false"/>
-          <w:sz w:val="20"/>
-          <w:szCs w:val="20"/>
-        </w:rPr>
-        <w:t xml:space="preserve">Feb 2025 – Apr 2026</w:t>
-      </w:r>
-    </w:p>
-    <w:p>
-      <w:pPr>
-        <w:spacing w:after="60"/>
-      </w:pPr>
-      <w:r>
-        <w:rPr>
-          <w:rFonts w:ascii="Calibri" w:cs="Calibri" w:eastAsia="Calibri" w:hAnsi="Calibri"/>
-          <w:b w:val="false"/>
-          <w:bCs w:val="false"/>
-          <w:i/>
-          <w:iCs/>
-          <w:sz w:val="20"/>
-          <w:szCs w:val="20"/>
-        </w:rPr>
-        <w:t xml:space="preserve">Malaberg, London, United Kingdom</w:t>
+        <w:t xml:space="preserve">Converted 4 high net worth clients onto the loans product in Malaysia within 1 month of launch, running go-to-market across paid media, affiliate and referral channels, and establishing a compliance review process for the new market</w:t>
       </w:r>
     </w:p>
     <w:p>
@@ -392,7 +331,68 @@
           <w:sz w:val="20"/>
           <w:szCs w:val="20"/>
         </w:rPr>
-        <w:t xml:space="preserve">Managed £50k+ monthly paid budget with full accountability for efficiency, sustaining 120% ROAS</w:t>
+        <w:t xml:space="preserve">Led international expansion of paid search, increasing markets from 2 to 26 (13x), live campaigns from 9 to 121 (13x) and keywords from 47 to 2,597 (55x) with country-level bid and creative strategy</w:t>
+      </w:r>
+    </w:p>
+    <w:p>
+      <w:pPr>
+        <w:tabs>
+          <w:tab w:val="right" w:pos="10466"/>
+        </w:tabs>
+        <w:spacing w:after="10" w:before="100"/>
+      </w:pPr>
+      <w:r>
+        <w:rPr>
+          <w:rFonts w:ascii="Calibri" w:cs="Calibri" w:eastAsia="Calibri" w:hAnsi="Calibri"/>
+          <w:b/>
+          <w:bCs/>
+          <w:i w:val="false"/>
+          <w:iCs w:val="false"/>
+          <w:sz w:val="20"/>
+          <w:szCs w:val="20"/>
+        </w:rPr>
+        <w:t xml:space="preserve">Performance Marketer</w:t>
+      </w:r>
+      <w:r>
+        <w:rPr>
+          <w:rFonts w:ascii="Calibri" w:cs="Calibri" w:eastAsia="Calibri" w:hAnsi="Calibri"/>
+          <w:b w:val="false"/>
+          <w:bCs w:val="false"/>
+          <w:i w:val="false"/>
+          <w:iCs w:val="false"/>
+          <w:sz w:val="20"/>
+          <w:szCs w:val="20"/>
+        </w:rPr>
+        <w:t xml:space="preserve">	</w:t>
+      </w:r>
+      <w:r>
+        <w:rPr>
+          <w:rFonts w:ascii="Calibri" w:cs="Calibri" w:eastAsia="Calibri" w:hAnsi="Calibri"/>
+          <w:b/>
+          <w:bCs/>
+          <w:i w:val="false"/>
+          <w:iCs w:val="false"/>
+          <w:sz w:val="20"/>
+          <w:szCs w:val="20"/>
+        </w:rPr>
+        <w:t xml:space="preserve">Feb 2025 – Apr 2026</w:t>
+      </w:r>
+    </w:p>
+    <w:p>
+      <w:pPr>
+        <w:spacing w:after="60"/>
+      </w:pPr>
+      <w:r>
+        <w:rPr>
+          <w:rFonts w:ascii="Calibri" w:cs="Calibri" w:eastAsia="Calibri" w:hAnsi="Calibri"/>
+          <w:b w:val="false"/>
+          <w:bCs w:val="false"/>
+          <w:i/>
+          <w:iCs/>
+          <w:sz w:val="20"/>
+          <w:szCs w:val="20"/>
+        </w:rPr>
+        <w:t xml:space="preserve">Malaberg, London, United Kingdom</w:t>
       </w:r>
     </w:p>
     <w:p>
@@ -414,7 +414,7 @@
           <w:sz w:val="20"/>
           <w:szCs w:val="20"/>
         </w:rPr>
-        <w:t xml:space="preserve">Increased daily conversions from 10 to 50+ (5x) by rebuilding landing and promotional pages in Figma and Photoshop, informed by funnel analysis in Power BI, Excel and Microsoft Clarity, increased funnel progression by 5%</w:t>
+        <w:t xml:space="preserve">Built a company-wide automated reporting pipeline on lead conversion, cutting daily report preparation from 30 min to almost immediate output</w:t>
       </w:r>
     </w:p>
     <w:p>
@@ -436,7 +436,29 @@
           <w:sz w:val="20"/>
           <w:szCs w:val="20"/>
         </w:rPr>
-        <w:t xml:space="preserve">Built a company-wide automated reporting pipeline on lead conversion, cutting daily report preparation from 30 min to almost immediate output</w:t>
+        <w:t xml:space="preserve">Increased daily conversions from 10 to 50+ (5x) by rebuilding landing and promotional pages in Figma and Photoshop, informed by funnel analysis in Power BI, Excel and Microsoft Clarity, increased funnel progression by 5%</w:t>
+      </w:r>
+    </w:p>
+    <w:p>
+      <w:pPr>
+        <w:pStyle w:val="ListParagraph"/>
+        <w:numPr>
+          <w:ilvl w:val="0"/>
+          <w:numId w:val="2"/>
+        </w:numPr>
+        <w:spacing w:after="50"/>
+      </w:pPr>
+      <w:r>
+        <w:rPr>
+          <w:rFonts w:ascii="Calibri" w:cs="Calibri" w:eastAsia="Calibri" w:hAnsi="Calibri"/>
+          <w:b w:val="false"/>
+          <w:bCs w:val="false"/>
+          <w:i w:val="false"/>
+          <w:iCs w:val="false"/>
+          <w:sz w:val="20"/>
+          <w:szCs w:val="20"/>
+        </w:rPr>
+        <w:t xml:space="preserve">Managed £50k+ monthly paid budget with full accountability for efficiency, sustaining 120% ROAS</w:t>
       </w:r>
     </w:p>
     <w:p>
@@ -598,6 +620,30 @@
           <w:sz w:val="20"/>
           <w:szCs w:val="20"/>
         </w:rPr>
+        <w:t xml:space="preserve">AI &amp; automation: </w:t>
+      </w:r>
+      <w:r>
+        <w:rPr>
+          <w:rFonts w:ascii="Calibri" w:cs="Calibri" w:eastAsia="Calibri" w:hAnsi="Calibri"/>
+          <w:b w:val="false"/>
+          <w:bCs w:val="false"/>
+          <w:i w:val="false"/>
+          <w:iCs w:val="false"/>
+          <w:sz w:val="20"/>
+          <w:szCs w:val="20"/>
+        </w:rPr>
+        <w:t xml:space="preserve">Claude Code, Cursor, MCP and API integrations (Windsor.ai), vibe-coded apps and bots; </w:t>
+      </w:r>
+      <w:r>
+        <w:rPr>
+          <w:rFonts w:ascii="Calibri" w:cs="Calibri" w:eastAsia="Calibri" w:hAnsi="Calibri"/>
+          <w:b/>
+          <w:bCs/>
+          <w:i w:val="false"/>
+          <w:iCs w:val="false"/>
+          <w:sz w:val="20"/>
+          <w:szCs w:val="20"/>
+        </w:rPr>
         <w:t xml:space="preserve">Demand generation: </w:t>
       </w:r>
       <w:r>
@@ -683,30 +729,6 @@
           <w:szCs w:val="20"/>
         </w:rPr>
         <w:t xml:space="preserve">Dashboards (Streamlit, Power BI), funnel and cohort analysis, structured test design, Excel, Microsoft Clarity, SQL, Python, R; </w:t>
-      </w:r>
-      <w:r>
-        <w:rPr>
-          <w:rFonts w:ascii="Calibri" w:cs="Calibri" w:eastAsia="Calibri" w:hAnsi="Calibri"/>
-          <w:b/>
-          <w:bCs/>
-          <w:i w:val="false"/>
-          <w:iCs w:val="false"/>
-          <w:sz w:val="20"/>
-          <w:szCs w:val="20"/>
-        </w:rPr>
-        <w:t xml:space="preserve">AI &amp; automation: </w:t>
-      </w:r>
-      <w:r>
-        <w:rPr>
-          <w:rFonts w:ascii="Calibri" w:cs="Calibri" w:eastAsia="Calibri" w:hAnsi="Calibri"/>
-          <w:b w:val="false"/>
-          <w:bCs w:val="false"/>
-          <w:i w:val="false"/>
-          <w:iCs w:val="false"/>
-          <w:sz w:val="20"/>
-          <w:szCs w:val="20"/>
-        </w:rPr>
-        <w:t xml:space="preserve">Claude Code, Cursor, MCP and API integrations (Windsor.ai), vibe-coded apps and bots; </w:t>
       </w:r>
       <w:r>
         <w:rPr>

</xml_diff>

<commit_message>
Simplify FlexTrade skills into four ATS-friendly lines
Co-Authored-By: Claude Opus 5.5 <noreply@anthropic.com>
Claude-Session: https://claude.ai/code/session_01Qg3JRGKeFtCXXeV9rGpzwA
</commit_message>
<xml_diff>
--- a/dist/Jessie-Chan-CV-flextrade-marketing.docx
+++ b/dist/Jessie-Chan-CV-flextrade-marketing.docx
@@ -620,20 +620,25 @@
           <w:sz w:val="20"/>
           <w:szCs w:val="20"/>
         </w:rPr>
-        <w:t xml:space="preserve">AI &amp; automation: </w:t>
-      </w:r>
-      <w:r>
-        <w:rPr>
-          <w:rFonts w:ascii="Calibri" w:cs="Calibri" w:eastAsia="Calibri" w:hAnsi="Calibri"/>
-          <w:b w:val="false"/>
-          <w:bCs w:val="false"/>
-          <w:i w:val="false"/>
-          <w:iCs w:val="false"/>
-          <w:sz w:val="20"/>
-          <w:szCs w:val="20"/>
-        </w:rPr>
-        <w:t xml:space="preserve">Claude Code, Cursor, MCP and API integrations (Windsor.ai), vibe-coded apps and bots; </w:t>
-      </w:r>
+        <w:t xml:space="preserve">Marketing: </w:t>
+      </w:r>
+      <w:r>
+        <w:rPr>
+          <w:rFonts w:ascii="Calibri" w:cs="Calibri" w:eastAsia="Calibri" w:hAnsi="Calibri"/>
+          <w:b w:val="false"/>
+          <w:bCs w:val="false"/>
+          <w:i w:val="false"/>
+          <w:iCs w:val="false"/>
+          <w:sz w:val="20"/>
+          <w:szCs w:val="20"/>
+        </w:rPr>
+        <w:t xml:space="preserve">Demand generation, lead generation, product marketing, go-to-market, marketing planning, digital campaign management, email marketing, content creation, budget management</w:t>
+      </w:r>
+    </w:p>
+    <w:p>
+      <w:pPr>
+        <w:spacing w:after="60"/>
+      </w:pPr>
       <w:r>
         <w:rPr>
           <w:rFonts w:ascii="Calibri" w:cs="Calibri" w:eastAsia="Calibri" w:hAnsi="Calibri"/>
@@ -644,20 +649,25 @@
           <w:sz w:val="20"/>
           <w:szCs w:val="20"/>
         </w:rPr>
-        <w:t xml:space="preserve">Demand generation: </w:t>
-      </w:r>
-      <w:r>
-        <w:rPr>
-          <w:rFonts w:ascii="Calibri" w:cs="Calibri" w:eastAsia="Calibri" w:hAnsi="Calibri"/>
-          <w:b w:val="false"/>
-          <w:bCs w:val="false"/>
-          <w:i w:val="false"/>
-          <w:iCs w:val="false"/>
-          <w:sz w:val="20"/>
-          <w:szCs w:val="20"/>
-        </w:rPr>
-        <w:t xml:space="preserve">Lead generation and prospect databases, account-based outreach, paid media (Google Ads, LinkedIn, Meta, TikTok, Apple Search Ads), email and CRM communications, campaign budgets and tracking; </w:t>
-      </w:r>
+        <w:t xml:space="preserve">Tools: </w:t>
+      </w:r>
+      <w:r>
+        <w:rPr>
+          <w:rFonts w:ascii="Calibri" w:cs="Calibri" w:eastAsia="Calibri" w:hAnsi="Calibri"/>
+          <w:b w:val="false"/>
+          <w:bCs w:val="false"/>
+          <w:i w:val="false"/>
+          <w:iCs w:val="false"/>
+          <w:sz w:val="20"/>
+          <w:szCs w:val="20"/>
+        </w:rPr>
+        <w:t xml:space="preserve">Google Ads, LinkedIn Ads, Meta, TikTok, Adobe Creative Cloud (Photoshop), Figma, Microsoft Office (Excel), Power BI, Microsoft Clarity</w:t>
+      </w:r>
+    </w:p>
+    <w:p>
+      <w:pPr>
+        <w:spacing w:after="60"/>
+      </w:pPr>
       <w:r>
         <w:rPr>
           <w:rFonts w:ascii="Calibri" w:cs="Calibri" w:eastAsia="Calibri" w:hAnsi="Calibri"/>
@@ -668,68 +678,25 @@
           <w:sz w:val="20"/>
           <w:szCs w:val="20"/>
         </w:rPr>
-        <w:t xml:space="preserve">Product marketing: </w:t>
-      </w:r>
-      <w:r>
-        <w:rPr>
-          <w:rFonts w:ascii="Calibri" w:cs="Calibri" w:eastAsia="Calibri" w:hAnsi="Calibri"/>
-          <w:b w:val="false"/>
-          <w:bCs w:val="false"/>
-          <w:i w:val="false"/>
-          <w:iCs w:val="false"/>
-          <w:sz w:val="20"/>
-          <w:szCs w:val="20"/>
-        </w:rPr>
-        <w:t xml:space="preserve">Go-to-market and regional launch planning, positioning and messaging, voice-of-customer research, competitor research, regulated messaging review with Compliance (UK FinProm); </w:t>
-      </w:r>
-      <w:r>
-        <w:rPr>
-          <w:rFonts w:ascii="Calibri" w:cs="Calibri" w:eastAsia="Calibri" w:hAnsi="Calibri"/>
-          <w:b/>
-          <w:bCs/>
-          <w:i w:val="false"/>
-          <w:iCs w:val="false"/>
-          <w:sz w:val="20"/>
-          <w:szCs w:val="20"/>
-        </w:rPr>
-        <w:t xml:space="preserve">Content &amp; creative: </w:t>
-      </w:r>
-      <w:r>
-        <w:rPr>
-          <w:rFonts w:ascii="Calibri" w:cs="Calibri" w:eastAsia="Calibri" w:hAnsi="Calibri"/>
-          <w:b w:val="false"/>
-          <w:bCs w:val="false"/>
-          <w:i w:val="false"/>
-          <w:iCs w:val="false"/>
-          <w:sz w:val="20"/>
-          <w:szCs w:val="20"/>
-        </w:rPr>
-        <w:t xml:space="preserve">Creative briefing and direction, agency and partner management, Figma, Photoshop, AI video production, landing pages; </w:t>
-      </w:r>
-      <w:r>
-        <w:rPr>
-          <w:rFonts w:ascii="Calibri" w:cs="Calibri" w:eastAsia="Calibri" w:hAnsi="Calibri"/>
-          <w:b/>
-          <w:bCs/>
-          <w:i w:val="false"/>
-          <w:iCs w:val="false"/>
-          <w:sz w:val="20"/>
-          <w:szCs w:val="20"/>
-        </w:rPr>
-        <w:t xml:space="preserve">Measurement: </w:t>
-      </w:r>
-      <w:r>
-        <w:rPr>
-          <w:rFonts w:ascii="Calibri" w:cs="Calibri" w:eastAsia="Calibri" w:hAnsi="Calibri"/>
-          <w:b w:val="false"/>
-          <w:bCs w:val="false"/>
-          <w:i w:val="false"/>
-          <w:iCs w:val="false"/>
-          <w:sz w:val="20"/>
-          <w:szCs w:val="20"/>
-        </w:rPr>
-        <w:t xml:space="preserve">Dashboards (Streamlit, Power BI), funnel and cohort analysis, structured test design, Excel, Microsoft Clarity, SQL, Python, R; </w:t>
-      </w:r>
+        <w:t xml:space="preserve">AI &amp; data: </w:t>
+      </w:r>
+      <w:r>
+        <w:rPr>
+          <w:rFonts w:ascii="Calibri" w:cs="Calibri" w:eastAsia="Calibri" w:hAnsi="Calibri"/>
+          <w:b w:val="false"/>
+          <w:bCs w:val="false"/>
+          <w:i w:val="false"/>
+          <w:iCs w:val="false"/>
+          <w:sz w:val="20"/>
+          <w:szCs w:val="20"/>
+        </w:rPr>
+        <w:t xml:space="preserve">Claude Code, Cursor, MCP and API integrations, AI content production, dashboards, SQL, Python, R</w:t>
+      </w:r>
+    </w:p>
+    <w:p>
+      <w:pPr>
+        <w:spacing w:after="60"/>
+      </w:pPr>
       <w:r>
         <w:rPr>
           <w:rFonts w:ascii="Calibri" w:cs="Calibri" w:eastAsia="Calibri" w:hAnsi="Calibri"/>

</xml_diff>

<commit_message>
Make FlexTrade bullets result-led with active verbs
Co-Authored-By: Claude Opus 5.5 <noreply@anthropic.com>
Claude-Session: https://claude.ai/code/session_01Qg3JRGKeFtCXXeV9rGpzwA
</commit_message>
<xml_diff>
--- a/dist/Jessie-Chan-CV-flextrade-marketing.docx
+++ b/dist/Jessie-Chan-CV-flextrade-marketing.docx
@@ -155,7 +155,7 @@
           <w:sz w:val="20"/>
           <w:szCs w:val="20"/>
         </w:rPr>
-        <w:t xml:space="preserve">Identified that reliance on real creators was exhausting ad creative and built an AI-powered UGC production workflow, delivering 100+ video assets across TikTok and Google Ads, increasing CTR from 0.4% to 1.15% (+188%), reducing CPI from $25 to $6 (−76%), and cutting production time by 75%</w:t>
+        <w:t xml:space="preserve">Increased CTR from 0.4% to 1.15% (+188%) and reduced CPI from $25 to $6 (−76%) by building an AI UGC production workflow to replace exhausted creator content, delivering 100+ video assets and cutting production time by 75%</w:t>
       </w:r>
     </w:p>
     <w:p>
@@ -177,7 +177,7 @@
           <w:sz w:val="20"/>
           <w:szCs w:val="20"/>
         </w:rPr>
-        <w:t xml:space="preserve">Solved outdated creator assets after the Earn rebrand by recreating them with AI UGC, driving 600+ installs in the first week after relaunch</w:t>
+        <w:t xml:space="preserve">Drove 600+ installs in the first week of the Earn relaunch by recreating outdated creator assets with AI UGC after the rebrand</w:t>
       </w:r>
     </w:p>
     <w:p>
@@ -199,7 +199,7 @@
           <w:sz w:val="20"/>
           <w:szCs w:val="20"/>
         </w:rPr>
-        <w:t xml:space="preserve">Spotted a high net worth acquisition opportunity during the MiCAR transition and built an 80-publisher contact list with AI, sourcing 3 major clients</w:t>
+        <w:t xml:space="preserve">Sourced 3 major high net worth clients by spotting an acquisition opportunity during the MiCAR transition and building an 80-publisher contact list with AI</w:t>
       </w:r>
     </w:p>
     <w:p>
@@ -221,7 +221,7 @@
           <w:sz w:val="20"/>
           <w:szCs w:val="20"/>
         </w:rPr>
-        <w:t xml:space="preserve">Replaced 30 min/day of manual paid media reporting with automation built in Claude Code, Cursor and MCP connectors, and partnered with Data Engineering and Security to publish it as an internal dashboard</w:t>
+        <w:t xml:space="preserve">Eliminated 30 min/day of manual reporting by automating paid media reporting with Claude Code, Cursor and MCP connectors, and partnered with Data Engineering and Security to publish it as an internal dashboard</w:t>
       </w:r>
     </w:p>
     <w:p>
@@ -243,7 +243,7 @@
           <w:sz w:val="20"/>
           <w:szCs w:val="20"/>
         </w:rPr>
-        <w:t xml:space="preserve">Automated localisation of CRM communications into 24 languages with built-in CRM APIs, increasing email open rate by 10%</w:t>
+        <w:t xml:space="preserve">Increased email open rate by 10% by automating localisation of CRM communications into 24 languages with built-in CRM APIs</w:t>
       </w:r>
     </w:p>
     <w:p>
@@ -265,7 +265,7 @@
           <w:sz w:val="20"/>
           <w:szCs w:val="20"/>
         </w:rPr>
-        <w:t xml:space="preserve">Found through voice-of-customer research that users churned because they did not understand perps, and introduced an explainer that increased user retention by 12% as cumulative trading volume grew from $100m to $500m (5x) in two months</w:t>
+        <w:t xml:space="preserve">Grew cumulative perps trading volume from $100m to $500m (5x) in two months and increased user retention by 12% by introducing a perps explainer after voice-of-customer research showed churned users did not understand the product</w:t>
       </w:r>
     </w:p>
     <w:p>
@@ -287,7 +287,7 @@
           <w:sz w:val="20"/>
           <w:szCs w:val="20"/>
         </w:rPr>
-        <w:t xml:space="preserve">Generated 20+ active leads for Institutional business development by building a 100-operator prospect database, working with B2B Product Marketing on Institutional and Wealth projects</w:t>
+        <w:t xml:space="preserve">Generated 20+ active leads for Institutional business development by building a 100-operator prospect database, partnering with B2B Product Marketing on Institutional and Wealth projects</w:t>
       </w:r>
     </w:p>
     <w:p>
@@ -309,7 +309,7 @@
           <w:sz w:val="20"/>
           <w:szCs w:val="20"/>
         </w:rPr>
-        <w:t xml:space="preserve">Converted 4 high net worth clients onto the loans product in Malaysia within 1 month of launch, running go-to-market across paid media, affiliate and referral channels, and establishing a compliance review process for the new market</w:t>
+        <w:t xml:space="preserve">Converted 4 high net worth clients onto the loans product in Malaysia within 1 month of launch by running go-to-market across paid media, affiliate and referral channels and establishing a compliance review process for the new market</w:t>
       </w:r>
     </w:p>
     <w:p>
@@ -331,7 +331,7 @@
           <w:sz w:val="20"/>
           <w:szCs w:val="20"/>
         </w:rPr>
-        <w:t xml:space="preserve">Led international expansion of paid search, increasing markets from 2 to 26 (13x), live campaigns from 9 to 121 (13x) and keywords from 47 to 2,597 (55x) with country-level bid and creative strategy</w:t>
+        <w:t xml:space="preserve">Expanded paid search from 2 to 26 markets (13x), growing live campaigns from 9 to 121 (13x) and keywords from 47 to 2,597 (55x) through country-level bid and creative strategy</w:t>
       </w:r>
     </w:p>
     <w:p>
@@ -414,7 +414,7 @@
           <w:sz w:val="20"/>
           <w:szCs w:val="20"/>
         </w:rPr>
-        <w:t xml:space="preserve">Built a company-wide automated reporting pipeline on lead conversion, cutting daily report preparation from 30 min to almost immediate output</w:t>
+        <w:t xml:space="preserve">Cut daily report preparation from 30 min to near-instant by building a company-wide automated reporting pipeline on lead conversion</w:t>
       </w:r>
     </w:p>
     <w:p>
@@ -436,7 +436,7 @@
           <w:sz w:val="20"/>
           <w:szCs w:val="20"/>
         </w:rPr>
-        <w:t xml:space="preserve">Increased daily conversions from 10 to 50+ (5x) by rebuilding landing and promotional pages in Figma and Photoshop, informed by funnel analysis in Power BI, Excel and Microsoft Clarity, increased funnel progression by 5%</w:t>
+        <w:t xml:space="preserve">Increased daily conversions from 10 to 50+ (5x) and funnel progression by 5% by rebuilding landing and promotional pages in Figma and Photoshop, informed by funnel analysis in Power BI, Excel and Microsoft Clarity</w:t>
       </w:r>
     </w:p>
     <w:p>
@@ -458,7 +458,7 @@
           <w:sz w:val="20"/>
           <w:szCs w:val="20"/>
         </w:rPr>
-        <w:t xml:space="preserve">Managed £50k+ monthly paid budget with full accountability for efficiency, sustaining 120% ROAS</w:t>
+        <w:t xml:space="preserve">Sustained 120% ROAS on £50k+ monthly paid budget with full accountability for efficiency</w:t>
       </w:r>
     </w:p>
     <w:p>

</xml_diff>

<commit_message>
Spell out crypto terms on the FlexTrade CV and cover letter
FlexTrade is a capital markets firm. MiCAR, perps, KOL and UGC are now
explained, and the letter names FlexDigitalAssets as the link to her
crypto experience.

Co-Authored-By: Claude Opus 5.5 <noreply@anthropic.com>
Claude-Session: https://claude.ai/code/session_01Qg3JRGKeFtCXXeV9rGpzwA
</commit_message>
<xml_diff>
--- a/dist/Jessie-Chan-CV-flextrade-marketing.docx
+++ b/dist/Jessie-Chan-CV-flextrade-marketing.docx
@@ -155,7 +155,7 @@
           <w:sz w:val="20"/>
           <w:szCs w:val="20"/>
         </w:rPr>
-        <w:t xml:space="preserve">Increased CTR from 0.4% to 1.15% (+188%) and reduced CPI from $25 to $6 (−76%) by building an AI UGC production workflow to replace exhausted creator content, delivering 100+ video assets and cutting production time by 75%</w:t>
+        <w:t xml:space="preserve">Increased CTR from 0.4% to 1.15% (+188%) and reduced CPI from $25 to $6 (−76%) by building an AI video (UGC) production workflow to replace exhausted creator content, delivering 100+ video assets and cutting production time by 75%</w:t>
       </w:r>
     </w:p>
     <w:p>
@@ -177,7 +177,7 @@
           <w:sz w:val="20"/>
           <w:szCs w:val="20"/>
         </w:rPr>
-        <w:t xml:space="preserve">Drove 600+ installs in the first week of the Earn relaunch by recreating outdated creator assets with AI UGC after the rebrand</w:t>
+        <w:t xml:space="preserve">Drove 600+ installs in the first week of the Earn relaunch by recreating outdated creator assets with AI video after the rebrand</w:t>
       </w:r>
     </w:p>
     <w:p>
@@ -199,7 +199,7 @@
           <w:sz w:val="20"/>
           <w:szCs w:val="20"/>
         </w:rPr>
-        <w:t xml:space="preserve">Sourced 3 major high net worth clients by spotting an acquisition opportunity during the MiCAR transition and building an 80-publisher contact list with AI</w:t>
+        <w:t xml:space="preserve">Sourced 3 major high net worth clients by spotting an acquisition opportunity during the transition to MiCAR, the EU's crypto regulation, and building an 80-publisher contact list with AI</w:t>
       </w:r>
     </w:p>
     <w:p>
@@ -265,7 +265,7 @@
           <w:sz w:val="20"/>
           <w:szCs w:val="20"/>
         </w:rPr>
-        <w:t xml:space="preserve">Grew cumulative perps trading volume from $100m to $500m (5x) in two months and increased user retention by 12% by introducing a perps explainer after voice-of-customer research showed churned users did not understand the product</w:t>
+        <w:t xml:space="preserve">Grew cumulative perpetual futures trading volume from $100m to $500m (5x) in two months and increased user retention by 12% by introducing a product explainer after voice-of-customer research showed churned users did not understand the product</w:t>
       </w:r>
     </w:p>
     <w:p>

</xml_diff>

<commit_message>
Lead the FlexTrade CV with lead generation; drop 'myself' from the letter
Co-Authored-By: Claude Opus 5.5 <noreply@anthropic.com>
Claude-Session: https://claude.ai/code/session_01Qg3JRGKeFtCXXeV9rGpzwA
</commit_message>
<xml_diff>
--- a/dist/Jessie-Chan-CV-flextrade-marketing.docx
+++ b/dist/Jessie-Chan-CV-flextrade-marketing.docx
@@ -155,7 +155,7 @@
           <w:sz w:val="20"/>
           <w:szCs w:val="20"/>
         </w:rPr>
-        <w:t xml:space="preserve">Increased CTR from 0.4% to 1.15% (+188%) and reduced CPI from $25 to $6 (−76%) by building an AI video (UGC) production workflow to replace exhausted creator content, delivering 100+ video assets and cutting production time by 75%</w:t>
+        <w:t xml:space="preserve">Sourced 3 major high net worth clients by spotting that a major exchange was losing access to European clients under new EU crypto regulation (MiCAR), and building an 80-publisher contact list with AI</w:t>
       </w:r>
     </w:p>
     <w:p>
@@ -177,7 +177,7 @@
           <w:sz w:val="20"/>
           <w:szCs w:val="20"/>
         </w:rPr>
-        <w:t xml:space="preserve">Drove 600+ installs in the first week of the Earn relaunch by recreating outdated creator assets with AI video after the rebrand</w:t>
+        <w:t xml:space="preserve">Generated 20+ active leads for Institutional business development by building a 100-operator prospect database, partnering with B2B Product Marketing on Institutional and Wealth projects</w:t>
       </w:r>
     </w:p>
     <w:p>
@@ -199,7 +199,7 @@
           <w:sz w:val="20"/>
           <w:szCs w:val="20"/>
         </w:rPr>
-        <w:t xml:space="preserve">Sourced 3 major high net worth clients by spotting that a major exchange was losing access to European clients under new EU crypto regulation (MiCAR), and building an 80-publisher contact list with AI</w:t>
+        <w:t xml:space="preserve">Converted 4 high net worth clients onto the loans product in Malaysia within 1 month of launch by running go-to-market across paid media, affiliate and referral channels and establishing a compliance review process for the new market</w:t>
       </w:r>
     </w:p>
     <w:p>
@@ -221,7 +221,7 @@
           <w:sz w:val="20"/>
           <w:szCs w:val="20"/>
         </w:rPr>
-        <w:t xml:space="preserve">Eliminated 30 min/day of manual reporting by automating paid media reporting with Claude Code, Cursor and MCP connectors, and partnered with Data Engineering and Security to publish it as an internal dashboard</w:t>
+        <w:t xml:space="preserve">Grew cumulative perpetual futures trading volume from $100m to $500m (5x) in two months and increased user retention by 12% by introducing a product explainer after voice-of-customer research showed churned users did not understand the product</w:t>
       </w:r>
     </w:p>
     <w:p>
@@ -243,7 +243,7 @@
           <w:sz w:val="20"/>
           <w:szCs w:val="20"/>
         </w:rPr>
-        <w:t xml:space="preserve">Increased email open rate by 10% by automating localisation of CRM communications into 24 languages with built-in CRM APIs</w:t>
+        <w:t xml:space="preserve">Increased CTR from 0.4% to 1.15% (+188%) and reduced CPI from $25 to $6 (−76%) by building an AI video (UGC) production workflow to replace exhausted creator content, delivering 100+ video assets and cutting production time by 75%</w:t>
       </w:r>
     </w:p>
     <w:p>
@@ -265,7 +265,7 @@
           <w:sz w:val="20"/>
           <w:szCs w:val="20"/>
         </w:rPr>
-        <w:t xml:space="preserve">Grew cumulative perpetual futures trading volume from $100m to $500m (5x) in two months and increased user retention by 12% by introducing a product explainer after voice-of-customer research showed churned users did not understand the product</w:t>
+        <w:t xml:space="preserve">Drove 600+ installs in the first week of the Earn relaunch by recreating outdated creator assets with AI video after the rebrand</w:t>
       </w:r>
     </w:p>
     <w:p>
@@ -287,7 +287,7 @@
           <w:sz w:val="20"/>
           <w:szCs w:val="20"/>
         </w:rPr>
-        <w:t xml:space="preserve">Generated 20+ active leads for Institutional business development by building a 100-operator prospect database, partnering with B2B Product Marketing on Institutional and Wealth projects</w:t>
+        <w:t xml:space="preserve">Increased email open rate by 10% by automating localisation of CRM communications into 24 languages with built-in CRM APIs</w:t>
       </w:r>
     </w:p>
     <w:p>
@@ -309,7 +309,7 @@
           <w:sz w:val="20"/>
           <w:szCs w:val="20"/>
         </w:rPr>
-        <w:t xml:space="preserve">Converted 4 high net worth clients onto the loans product in Malaysia within 1 month of launch by running go-to-market across paid media, affiliate and referral channels and establishing a compliance review process for the new market</w:t>
+        <w:t xml:space="preserve">Eliminated 30 min/day of manual reporting by automating paid media reporting with Claude Code, Cursor and MCP connectors, and partnered with Data Engineering and Security to publish it as an internal dashboard</w:t>
       </w:r>
     </w:p>
     <w:p>

</xml_diff>